<commit_message>
docs(demo 17/10): so sánh kết quả chạy thật trên Cowork với đáp án; sửa nguồn Nghị quyết 26-NQ/TW (có trong kho 02) trong báo cáo rà soát chạy trước
Co-Authored-By: Claude Opus 5.5 <noreply@anthropic.com>
</commit_message>
<xml_diff>
--- a/30-Ket-Qua/2026-10-12/De-Mo-17-10/Ket-qua-chay-truoc/BaoCao_RaSoat-897-v2.25_Chuong-trinh-cong-tac-thang-10-2026_van-ban-Dang_an-danh.docx
+++ b/30-Ket-Qua/2026-10-12/De-Mo-17-10/Ket-qua-chay-truoc/BaoCao_RaSoat-897-v2.25_Chuong-trinh-cong-tac-thang-10-2026_van-ban-Dang_an-danh.docx
@@ -538,7 +538,7 @@
                 <w:i w:val="0"/>
                 <w:sz w:val="26"/>
               </w:rPr>
-              <w:t>Kho 01: Quy định số 399-QĐ/TW, Hướng dẫn số 05-HD/VPTW, Quy định số 208-QĐ/TW, Hướng dẫn số 02-HD/TW. Kho 02: Nghị quyết số 27-NQ/TW ngày 28/8/2026 (đã mở bản gốc, khớp số, ngày, cơ quan ban hành, trích yếu). Tra cứu Internet ngày 12/10/2026 (báo chí chính thống đăng lại văn bản): Nghị quyết số 26-NQ/TW ngày 22/8/2026, Kết luận số 76-KL/TW ngày 28/7/2026, Kết luận số 226-KL/TW ngày 11/12/2025 - khớp số, ngày, cơ quan ban hành, trích yếu; chưa đối chiếu toàn văn</w:t>
+              <w:t>Kho 01: Quy định số 399-QĐ/TW, Hướng dẫn số 05-HD/VPTW, Quy định số 208-QĐ/TW, Hướng dẫn số 02-HD/TW. Kho 02: Nghị quyết số 26-NQ/TW ngày 22/8/2026, Nghị quyết số 27-NQ/TW ngày 28/8/2026 (đã mở bản gốc, khớp số, ngày, cơ quan ban hành, trích yếu). Tra cứu Internet ngày 12/10/2026 (báo chí chính thống đăng lại văn bản): Kết luận số 76-KL/TW ngày 28/7/2026, Kết luận số 226-KL/TW ngày 11/12/2025 - khớp số, ngày, cơ quan ban hành, trích yếu; chưa đối chiếu toàn văn</w:t>
             </w:r>
           </w:p>
         </w:tc>
@@ -5550,7 +5550,7 @@
           <w:i w:val="0"/>
           <w:sz w:val="28"/>
         </w:rPr>
-        <w:t>- Viện dẫn văn bản của Trung ương: Nghị quyết số 27-NQ/TW khớp bản gốc trong kho; Nghị quyết số 26-NQ/TW, Kết luận số 76-KL/TW, Kết luận số 226-KL/TW khớp số, ngày, cơ quan ban hành, trích yếu theo nguồn báo chí chính thống.</w:t>
+        <w:t>- Viện dẫn văn bản của Trung ương: Nghị quyết số 26-NQ/TW, 27-NQ/TW khớp bản gốc trong kho; Kết luận số 76-KL/TW, Kết luận số 226-KL/TW khớp số, ngày, cơ quan ban hành, trích yếu theo nguồn báo chí chính thống.</w:t>
       </w:r>
     </w:p>
     <w:p>
@@ -6918,7 +6918,7 @@
                 <w:i w:val="0"/>
                 <w:sz w:val="26"/>
               </w:rPr>
-              <w:t>Tệp dự thảo .docx (đọc nội dung, đo định dạng); kho KTC-Database 01, 02 (Quy định số 399-QĐ/TW, Hướng dẫn số 05-HD/VPTW, Quy định số 208-QĐ/TW, Hướng dẫn số 02-HD/TW, Nghị quyết số 27-NQ/TW); báo chí chính thống tra cứu ngày 12/10/2026 (Nghị quyết số 26-NQ/TW, Kết luận số 76-KL/TW, Kết luận số 226-KL/TW - chỉ đối chiếu số, ngày, cơ quan ban hành, trích yếu); Skill 29 và Phụ lục 2, 3, Checklist 02, 03, 04, 06 của Bộ quy tắc KTC-Ra-Soat-897 v2.25. · Công cụ hỗ trợ: Hệ KTC-Ra-Soat-897-v2-Cai-tien (Skill ktc-ra-soat-897, v2.25), chạy ngày 12/10/2026.</w:t>
+              <w:t>Tệp dự thảo .docx (đọc nội dung, đo định dạng); kho KTC-Database 01, 02 (Quy định số 399-QĐ/TW, Hướng dẫn số 05-HD/VPTW, Quy định số 208-QĐ/TW, Hướng dẫn số 02-HD/TW, Nghị quyết số 26-NQ/TW, 27-NQ/TW); báo chí chính thống tra cứu ngày 12/10/2026 (Kết luận số 76-KL/TW, Kết luận số 226-KL/TW - chỉ đối chiếu số, ngày, cơ quan ban hành, trích yếu); Skill 29 và Phụ lục 2, 3, Checklist 02, 03, 04, 06 của Bộ quy tắc KTC-Ra-Soat-897 v2.25. · Công cụ hỗ trợ: Hệ KTC-Ra-Soat-897-v2-Cai-tien (Skill ktc-ra-soat-897, v2.25), chạy ngày 13/10/2026.</w:t>
             </w:r>
           </w:p>
         </w:tc>

</xml_diff>